<commit_message>
Adiciona 4 esquemas visuais ao relatorio e integra achado do subgenoma brizantha
Novos esquemas (bin/gerar_figuras_esquematicas.py, paleta da skill dataviz,
cores categoricas em ordem fixa):
- Fluxograma do pipeline (11 processos, agrupados por funcao)
- Estrutura genica em escala: predicao original (so CDS) vs. anotacao real
  no subgenoma brizantha (com UTRs)
- Diagrama de convergencia das 6 linhas de evidencia de locus_001
- Mapa dos 36 cromossomos do assembly U. decumbens (subgenomas b/rd) com
  as 3 copias homeologas de locus_001 marcadas

relatorio_isa_lbmp.docx regenerado: 7 figuras, 4 tabelas, com a secao 3.7
(confirmacao no subgenoma real de brizantha) e os gargalos 5.2/5.5
atualizados para "parcialmente resolvido" integrados em todo o documento
(sumario executivo, resultados, discussao, conclusao).
</commit_message>
<xml_diff>
--- a/relatorio_isa_lbmp.docx
+++ b/relatorio_isa_lbmp.docx
@@ -104,11 +104,21 @@
     <w:p>
       <w:r>
         <w:rPr>
+          <w:b/>
+          <w:i w:val="0"/>
+          <w:sz w:val="22"/>
+        </w:rPr>
+        <w:t>Um TERCEIRO achado, obtido no mesmo dia da revisão que originou este relatório (11/07/2026), reduz diretamente a maior limitação apontada abaixo: não existe assembly próprio de U. brizantha, mas o assembly haplótipo-resolvido de Urochloa decumbens cv. Basilisk (GCA_964030465.3) tem cromossomos rotulados por origem de subgenoma, e 18 deles vêm de U. brizantha diploide real. Uma busca de locus_001 nesse proteoma encontrou uma cópia no subgenoma brizantha com 99,4% de identidade (1 aminoácido de diferença) e anotação de UTRs reais — informação que a predição original nunca teve (Seção 3.7).</w:t>
+      </w:r>
+    </w:p>
+    <w:p>
+      <w:r>
+        <w:rPr>
           <w:b w:val="0"/>
           <w:i w:val="0"/>
           <w:sz w:val="22"/>
         </w:rPr>
-        <w:t>IMPORTANTE — este relatório distingue explicitamente "candidato confirmado por bioinformática" de "sequência pronta para desenho final de dsRNA em bancada". A Seção 5 detalha três gargalos que devem ser resolvidos antes de qualquer síntese de dsRNA: ausência de validação experimental, divergência não quantificada entre a espécie usada na análise (U. ruziziensis) e a espécie-alvo real (U. brizantha), e ausência da análise de especificidade off-target exigida pela proposta científica do projeto.</w:t>
+        <w:t>IMPORTANTE — este relatório distingue explicitamente "candidato confirmado por bioinformática" de "sequência pronta para desenho final de dsRNA em bancada". A Seção 5 detalha os gargalos que devem ser resolvidos antes de qualquer síntese de dsRNA. Dois deles — divergência entre a espécie usada na análise original e a espécie-alvo real, e ausência de UTR — foram substancialmente reduzidos pelo achado acima. Seguem sem resolver: ausência de validação experimental na cultivar de trabalho (Marandu) e ausência da análise de especificidade off-target exigida pela proposta científica do projeto.</w:t>
       </w:r>
     </w:p>
     <w:p>
@@ -920,6 +930,59 @@
       </w:r>
     </w:p>
     <w:p>
+      <w:pPr>
+        <w:jc w:val="center"/>
+      </w:pPr>
+      <w:r>
+        <w:drawing>
+          <wp:inline xmlns:a="http://schemas.openxmlformats.org/drawingml/2006/main" xmlns:pic="http://schemas.openxmlformats.org/drawingml/2006/picture">
+            <wp:extent cx="3960000" cy="5720000"/>
+            <wp:docPr id="1" name="Picture 1"/>
+            <wp:cNvGraphicFramePr>
+              <a:graphicFrameLocks noChangeAspect="1"/>
+            </wp:cNvGraphicFramePr>
+            <a:graphic>
+              <a:graphicData uri="http://schemas.openxmlformats.org/drawingml/2006/picture">
+                <pic:pic>
+                  <pic:nvPicPr>
+                    <pic:cNvPr id="0" name="esquema_pipeline.png"/>
+                    <pic:cNvPicPr/>
+                  </pic:nvPicPr>
+                  <pic:blipFill>
+                    <a:blip r:embed="rId9"/>
+                    <a:stretch>
+                      <a:fillRect/>
+                    </a:stretch>
+                  </pic:blipFill>
+                  <pic:spPr>
+                    <a:xfrm>
+                      <a:off x="0" y="0"/>
+                      <a:ext cx="3960000" cy="5720000"/>
+                    </a:xfrm>
+                    <a:prstGeom prst="rect"/>
+                  </pic:spPr>
+                </pic:pic>
+              </a:graphicData>
+            </a:graphic>
+          </wp:inline>
+        </w:drawing>
+      </w:r>
+    </w:p>
+    <w:p>
+      <w:pPr>
+        <w:spacing w:after="240"/>
+        <w:jc w:val="center"/>
+      </w:pPr>
+      <w:r>
+        <w:rPr>
+          <w:i/>
+          <w:color w:val="555555"/>
+          <w:sz w:val="18"/>
+        </w:rPr>
+        <w:t>Figura A. Fluxograma do pipeline de bioinformática (11 processos Nextflow), agrupados por função: descoberta de loci (azul), confirmação de ortologia (verde-água) e filogenia/relatório (violeta).</w:t>
+      </w:r>
+    </w:p>
+    <w:p>
       <w:r>
         <w:rPr>
           <w:b w:val="0"/>
@@ -1293,7 +1356,7 @@
         <w:drawing>
           <wp:inline xmlns:a="http://schemas.openxmlformats.org/drawingml/2006/main" xmlns:pic="http://schemas.openxmlformats.org/drawingml/2006/picture">
             <wp:extent cx="5400000" cy="3132000"/>
-            <wp:docPr id="1" name="Picture 1"/>
+            <wp:docPr id="2" name="Picture 2"/>
             <wp:cNvGraphicFramePr>
               <a:graphicFrameLocks noChangeAspect="1"/>
             </wp:cNvGraphicFramePr>
@@ -1305,7 +1368,7 @@
                     <pic:cNvPicPr/>
                   </pic:nvPicPr>
                   <pic:blipFill>
-                    <a:blip r:embed="rId9"/>
+                    <a:blip r:embed="rId10"/>
                     <a:stretch>
                       <a:fillRect/>
                     </a:stretch>
@@ -2076,7 +2139,7 @@
         <w:drawing>
           <wp:inline xmlns:a="http://schemas.openxmlformats.org/drawingml/2006/main" xmlns:pic="http://schemas.openxmlformats.org/drawingml/2006/picture">
             <wp:extent cx="3240000" cy="5724000"/>
-            <wp:docPr id="2" name="Picture 2"/>
+            <wp:docPr id="3" name="Picture 3"/>
             <wp:cNvGraphicFramePr>
               <a:graphicFrameLocks noChangeAspect="1"/>
             </wp:cNvGraphicFramePr>
@@ -2088,7 +2151,7 @@
                     <pic:cNvPicPr/>
                   </pic:nvPicPr>
                   <pic:blipFill>
-                    <a:blip r:embed="rId10"/>
+                    <a:blip r:embed="rId11"/>
                     <a:stretch>
                       <a:fillRect/>
                     </a:stretch>
@@ -2224,7 +2287,7 @@
         <w:drawing>
           <wp:inline xmlns:a="http://schemas.openxmlformats.org/drawingml/2006/main" xmlns:pic="http://schemas.openxmlformats.org/drawingml/2006/picture">
             <wp:extent cx="5760000" cy="4992000"/>
-            <wp:docPr id="3" name="Picture 3"/>
+            <wp:docPr id="4" name="Picture 4"/>
             <wp:cNvGraphicFramePr>
               <a:graphicFrameLocks noChangeAspect="1"/>
             </wp:cNvGraphicFramePr>
@@ -2236,7 +2299,7 @@
                     <pic:cNvPicPr/>
                   </pic:nvPicPr>
                   <pic:blipFill>
-                    <a:blip r:embed="rId11"/>
+                    <a:blip r:embed="rId12"/>
                     <a:stretch>
                       <a:fillRect/>
                     </a:stretch>
@@ -2318,7 +2381,642 @@
           <w:i w:val="0"/>
           <w:sz w:val="22"/>
         </w:rPr>
-        <w:t>Todos os resultados acima referem-se a loci identificados no genoma de Urochloa ruziziensis, usado como proxy diploide na ausência de assembly próprio de U. brizantha. Nenhuma das 15 sequências homólogas recuperadas por BLASTP (Seção 2.2) pertence a U. ruziziensis ou U. brizantha especificamente — todas vêm de U. humidicola e U. decumbens, refletindo a escassez de proteínas anotadas das duas primeiras espécies em bancos públicos. As implicações práticas dessa limitação para o desenho de dsRNA estão detalhadas na Seção 5.2.</w:t>
+        <w:t>Todos os resultados das Seções 3.1 a 3.5 referem-se a loci identificados no genoma de Urochloa ruziziensis, usado como proxy diploide na ausência de assembly próprio de U. brizantha. Nenhuma das 15 sequências homólogas recuperadas por BLASTP (Seção 2.2) pertence a U. ruziziensis ou U. brizantha especificamente — todas vêm de U. humidicola e U. decumbens, refletindo a escassez de proteínas anotadas das duas primeiras espécies em bancos públicos. Esta limitação foi substancialmente mitigada pelo achado da Seção 3.7.</w:t>
+      </w:r>
+    </w:p>
+    <w:p>
+      <w:pPr>
+        <w:pStyle w:val="Heading2"/>
+      </w:pPr>
+      <w:r>
+        <w:rPr>
+          <w:color w:val="1F3A5F"/>
+        </w:rPr>
+        <w:t>3.7 Confirmação em subgenoma real de U. brizantha (achado de 11/07/2026)</w:t>
+      </w:r>
+    </w:p>
+    <w:p>
+      <w:r>
+        <w:rPr>
+          <w:b w:val="0"/>
+          <w:i w:val="0"/>
+          <w:sz w:val="22"/>
+        </w:rPr>
+        <w:t>Não existe assembly próprio de U. brizantha, mas existe algo melhor que o proxy usado nas Seções 3.1–3.6: o assembly haplótipo-resolvido, cromossomo-completo de Urochloa decumbens cv. Basilisk (GCA_964030465.3, de Vega Group/Earlham Institute, ENA, BioProject PRJEB73762) é um alotetraploide cujos 36 cromossomos foram rotulados por origem de subgenoma, confirmado no próprio texto do artigo original: sufixo "b" = subgenoma derivado de U. brizantha diploide; sufixo "rd" = subgenoma derivado de U. ruziziensis/U. decumbens diploide.</w:t>
+      </w:r>
+    </w:p>
+    <w:p>
+      <w:r>
+        <w:rPr>
+          <w:b w:val="0"/>
+          <w:i w:val="0"/>
+          <w:sz w:val="22"/>
+        </w:rPr>
+        <w:t>BLASTP local (BLAST+ 2.17.0) da proteína de locus_001 contra o proteoma anotado de U. decumbens (150.710 proteínas) encontrou 5 cópias quase idênticas (99,4–100% identidade), refletindo a redundância de haplótipos do assembly:</w:t>
+      </w:r>
+    </w:p>
+    <w:tbl>
+      <w:tblPr>
+        <w:tblStyle w:val="TableGrid"/>
+        <w:tblW w:type="auto" w:w="0"/>
+        <w:jc w:val="center"/>
+        <w:tblLook w:firstColumn="1" w:firstRow="1" w:lastColumn="0" w:lastRow="0" w:noHBand="0" w:noVBand="1" w:val="04A0"/>
+      </w:tblPr>
+      <w:tblGrid>
+        <w:gridCol w:w="2351"/>
+        <w:gridCol w:w="2351"/>
+        <w:gridCol w:w="2351"/>
+        <w:gridCol w:w="2351"/>
+      </w:tblGrid>
+      <w:tr>
+        <w:tc>
+          <w:tcPr>
+            <w:tcW w:type="dxa" w:w="1701"/>
+            <w:shd w:fill="1F3A5F"/>
+          </w:tcPr>
+          <w:p>
+            <w:r>
+              <w:rPr>
+                <w:color w:val="FFFFFF"/>
+              </w:rPr>
+            </w:r>
+            <w:r>
+              <w:rPr>
+                <w:b/>
+                <w:sz w:val="18"/>
+              </w:rPr>
+              <w:t>Accession</w:t>
+            </w:r>
+          </w:p>
+        </w:tc>
+        <w:tc>
+          <w:tcPr>
+            <w:tcW w:type="dxa" w:w="1417"/>
+            <w:shd w:fill="1F3A5F"/>
+          </w:tcPr>
+          <w:p>
+            <w:r>
+              <w:rPr>
+                <w:color w:val="FFFFFF"/>
+              </w:rPr>
+            </w:r>
+            <w:r>
+              <w:rPr>
+                <w:b/>
+                <w:sz w:val="18"/>
+              </w:rPr>
+              <w:t>Identidade</w:t>
+            </w:r>
+          </w:p>
+        </w:tc>
+        <w:tc>
+          <w:tcPr>
+            <w:tcW w:type="dxa" w:w="2835"/>
+            <w:shd w:fill="1F3A5F"/>
+          </w:tcPr>
+          <w:p>
+            <w:r>
+              <w:rPr>
+                <w:color w:val="FFFFFF"/>
+              </w:rPr>
+            </w:r>
+            <w:r>
+              <w:rPr>
+                <w:b/>
+                <w:sz w:val="18"/>
+              </w:rPr>
+              <w:t>Cromossomo</w:t>
+            </w:r>
+          </w:p>
+        </w:tc>
+        <w:tc>
+          <w:tcPr>
+            <w:tcW w:type="dxa" w:w="2835"/>
+            <w:shd w:fill="1F3A5F"/>
+          </w:tcPr>
+          <w:p>
+            <w:r>
+              <w:rPr>
+                <w:color w:val="FFFFFF"/>
+              </w:rPr>
+            </w:r>
+            <w:r>
+              <w:rPr>
+                <w:b/>
+                <w:sz w:val="18"/>
+              </w:rPr>
+              <w:t>Subgenoma</w:t>
+            </w:r>
+          </w:p>
+        </w:tc>
+      </w:tr>
+      <w:tr>
+        <w:tc>
+          <w:tcPr>
+            <w:tcW w:type="dxa" w:w="1701"/>
+          </w:tcPr>
+          <w:p>
+            <w:r/>
+            <w:r>
+              <w:rPr>
+                <w:b w:val="0"/>
+                <w:sz w:val="18"/>
+              </w:rPr>
+              <w:t>CAL5036879.1</w:t>
+            </w:r>
+          </w:p>
+        </w:tc>
+        <w:tc>
+          <w:tcPr>
+            <w:tcW w:type="dxa" w:w="1417"/>
+          </w:tcPr>
+          <w:p>
+            <w:r/>
+            <w:r>
+              <w:rPr>
+                <w:b w:val="0"/>
+                <w:sz w:val="18"/>
+              </w:rPr>
+              <w:t>100,0%</w:t>
+            </w:r>
+          </w:p>
+        </w:tc>
+        <w:tc>
+          <w:tcPr>
+            <w:tcW w:type="dxa" w:w="2835"/>
+          </w:tcPr>
+          <w:p>
+            <w:r/>
+            <w:r>
+              <w:rPr>
+                <w:b w:val="0"/>
+                <w:sz w:val="18"/>
+              </w:rPr>
+              <w:t>33rd</w:t>
+            </w:r>
+          </w:p>
+        </w:tc>
+        <w:tc>
+          <w:tcPr>
+            <w:tcW w:type="dxa" w:w="2835"/>
+          </w:tcPr>
+          <w:p>
+            <w:r/>
+            <w:r>
+              <w:rPr>
+                <w:b w:val="0"/>
+                <w:sz w:val="18"/>
+              </w:rPr>
+              <w:t>ruziziensis/decumbens</w:t>
+            </w:r>
+          </w:p>
+        </w:tc>
+      </w:tr>
+      <w:tr>
+        <w:tc>
+          <w:tcPr>
+            <w:tcW w:type="dxa" w:w="1701"/>
+          </w:tcPr>
+          <w:p>
+            <w:r/>
+            <w:r>
+              <w:rPr>
+                <w:b w:val="0"/>
+                <w:sz w:val="18"/>
+              </w:rPr>
+              <w:t>CAM0151951.1</w:t>
+            </w:r>
+          </w:p>
+        </w:tc>
+        <w:tc>
+          <w:tcPr>
+            <w:tcW w:type="dxa" w:w="1417"/>
+          </w:tcPr>
+          <w:p>
+            <w:r/>
+            <w:r>
+              <w:rPr>
+                <w:b w:val="0"/>
+                <w:sz w:val="18"/>
+              </w:rPr>
+              <w:t>99,4%</w:t>
+            </w:r>
+          </w:p>
+        </w:tc>
+        <w:tc>
+          <w:tcPr>
+            <w:tcW w:type="dxa" w:w="2835"/>
+          </w:tcPr>
+          <w:p>
+            <w:r/>
+            <w:r>
+              <w:rPr>
+                <w:b w:val="0"/>
+                <w:sz w:val="18"/>
+              </w:rPr>
+              <w:t>scaffold não localizado</w:t>
+            </w:r>
+          </w:p>
+        </w:tc>
+        <w:tc>
+          <w:tcPr>
+            <w:tcW w:type="dxa" w:w="2835"/>
+          </w:tcPr>
+          <w:p>
+            <w:r/>
+            <w:r>
+              <w:rPr>
+                <w:b w:val="0"/>
+                <w:sz w:val="18"/>
+              </w:rPr>
+              <w:t>—</w:t>
+            </w:r>
+          </w:p>
+        </w:tc>
+      </w:tr>
+      <w:tr>
+        <w:tc>
+          <w:tcPr>
+            <w:tcW w:type="dxa" w:w="1701"/>
+          </w:tcPr>
+          <w:p>
+            <w:r/>
+            <w:r>
+              <w:rPr>
+                <w:b w:val="0"/>
+                <w:sz w:val="18"/>
+              </w:rPr>
+              <w:t>CAM0146821.1</w:t>
+            </w:r>
+          </w:p>
+        </w:tc>
+        <w:tc>
+          <w:tcPr>
+            <w:tcW w:type="dxa" w:w="1417"/>
+          </w:tcPr>
+          <w:p>
+            <w:r/>
+            <w:r>
+              <w:rPr>
+                <w:b w:val="0"/>
+                <w:sz w:val="18"/>
+              </w:rPr>
+              <w:t>99,4%</w:t>
+            </w:r>
+          </w:p>
+        </w:tc>
+        <w:tc>
+          <w:tcPr>
+            <w:tcW w:type="dxa" w:w="2835"/>
+          </w:tcPr>
+          <w:p>
+            <w:r/>
+            <w:r>
+              <w:rPr>
+                <w:b w:val="0"/>
+                <w:sz w:val="18"/>
+              </w:rPr>
+              <w:t>scaffold não localizado</w:t>
+            </w:r>
+          </w:p>
+        </w:tc>
+        <w:tc>
+          <w:tcPr>
+            <w:tcW w:type="dxa" w:w="2835"/>
+          </w:tcPr>
+          <w:p>
+            <w:r/>
+            <w:r>
+              <w:rPr>
+                <w:b w:val="0"/>
+                <w:sz w:val="18"/>
+              </w:rPr>
+              <w:t>—</w:t>
+            </w:r>
+          </w:p>
+        </w:tc>
+      </w:tr>
+      <w:tr>
+        <w:tc>
+          <w:tcPr>
+            <w:tcW w:type="dxa" w:w="1701"/>
+          </w:tcPr>
+          <w:p>
+            <w:r/>
+            <w:r>
+              <w:rPr>
+                <w:b w:val="0"/>
+                <w:sz w:val="18"/>
+              </w:rPr>
+              <w:t>CAL5051155.1</w:t>
+            </w:r>
+          </w:p>
+        </w:tc>
+        <w:tc>
+          <w:tcPr>
+            <w:tcW w:type="dxa" w:w="1417"/>
+          </w:tcPr>
+          <w:p>
+            <w:r/>
+            <w:r>
+              <w:rPr>
+                <w:b w:val="0"/>
+                <w:sz w:val="18"/>
+              </w:rPr>
+              <w:t>99,4%</w:t>
+            </w:r>
+          </w:p>
+        </w:tc>
+        <w:tc>
+          <w:tcPr>
+            <w:tcW w:type="dxa" w:w="2835"/>
+          </w:tcPr>
+          <w:p>
+            <w:r/>
+            <w:r>
+              <w:rPr>
+                <w:b w:val="0"/>
+                <w:sz w:val="18"/>
+              </w:rPr>
+              <w:t>36b</w:t>
+            </w:r>
+          </w:p>
+        </w:tc>
+        <w:tc>
+          <w:tcPr>
+            <w:tcW w:type="dxa" w:w="2835"/>
+          </w:tcPr>
+          <w:p>
+            <w:r/>
+            <w:r>
+              <w:rPr>
+                <w:b w:val="0"/>
+                <w:sz w:val="18"/>
+              </w:rPr>
+              <w:t>brizantha (real)</w:t>
+            </w:r>
+          </w:p>
+        </w:tc>
+      </w:tr>
+      <w:tr>
+        <w:tc>
+          <w:tcPr>
+            <w:tcW w:type="dxa" w:w="1701"/>
+          </w:tcPr>
+          <w:p>
+            <w:r/>
+            <w:r>
+              <w:rPr>
+                <w:b w:val="0"/>
+                <w:sz w:val="18"/>
+              </w:rPr>
+              <w:t>CAL5044486.1</w:t>
+            </w:r>
+          </w:p>
+        </w:tc>
+        <w:tc>
+          <w:tcPr>
+            <w:tcW w:type="dxa" w:w="1417"/>
+          </w:tcPr>
+          <w:p>
+            <w:r/>
+            <w:r>
+              <w:rPr>
+                <w:b w:val="0"/>
+                <w:sz w:val="18"/>
+              </w:rPr>
+              <w:t>99,4%</w:t>
+            </w:r>
+          </w:p>
+        </w:tc>
+        <w:tc>
+          <w:tcPr>
+            <w:tcW w:type="dxa" w:w="2835"/>
+          </w:tcPr>
+          <w:p>
+            <w:r/>
+            <w:r>
+              <w:rPr>
+                <w:b w:val="0"/>
+                <w:sz w:val="18"/>
+              </w:rPr>
+              <w:t>34rd</w:t>
+            </w:r>
+          </w:p>
+        </w:tc>
+        <w:tc>
+          <w:tcPr>
+            <w:tcW w:type="dxa" w:w="2835"/>
+          </w:tcPr>
+          <w:p>
+            <w:r/>
+            <w:r>
+              <w:rPr>
+                <w:b w:val="0"/>
+                <w:sz w:val="18"/>
+              </w:rPr>
+              <w:t>ruziziensis/decumbens</w:t>
+            </w:r>
+          </w:p>
+        </w:tc>
+      </w:tr>
+    </w:tbl>
+    <w:p>
+      <w:r>
+        <w:rPr>
+          <w:b w:val="0"/>
+          <w:i w:val="0"/>
+          <w:sz w:val="22"/>
+        </w:rPr>
+      </w:r>
+    </w:p>
+    <w:p>
+      <w:pPr>
+        <w:jc w:val="center"/>
+      </w:pPr>
+      <w:r>
+        <w:drawing>
+          <wp:inline xmlns:a="http://schemas.openxmlformats.org/drawingml/2006/main" xmlns:pic="http://schemas.openxmlformats.org/drawingml/2006/picture">
+            <wp:extent cx="5760000" cy="2436923"/>
+            <wp:docPr id="5" name="Picture 5"/>
+            <wp:cNvGraphicFramePr>
+              <a:graphicFrameLocks noChangeAspect="1"/>
+            </wp:cNvGraphicFramePr>
+            <a:graphic>
+              <a:graphicData uri="http://schemas.openxmlformats.org/drawingml/2006/picture">
+                <pic:pic>
+                  <pic:nvPicPr>
+                    <pic:cNvPr id="0" name="esquema_subgenomas_decumbens.png"/>
+                    <pic:cNvPicPr/>
+                  </pic:nvPicPr>
+                  <pic:blipFill>
+                    <a:blip r:embed="rId13"/>
+                    <a:stretch>
+                      <a:fillRect/>
+                    </a:stretch>
+                  </pic:blipFill>
+                  <pic:spPr>
+                    <a:xfrm>
+                      <a:off x="0" y="0"/>
+                      <a:ext cx="5760000" cy="2436923"/>
+                    </a:xfrm>
+                    <a:prstGeom prst="rect"/>
+                  </pic:spPr>
+                </pic:pic>
+              </a:graphicData>
+            </a:graphic>
+          </wp:inline>
+        </w:drawing>
+      </w:r>
+    </w:p>
+    <w:p>
+      <w:pPr>
+        <w:spacing w:after="240"/>
+        <w:jc w:val="center"/>
+      </w:pPr>
+      <w:r>
+        <w:rPr>
+          <w:i/>
+          <w:color w:val="555555"/>
+          <w:sz w:val="18"/>
+        </w:rPr>
+        <w:t>Figura D. Composição de subgenomas dos 36 cromossomos do assembly de U. decumbens cv. Basilisk (18 do subgenoma U. brizantha diploide, 18 do subgenoma U. ruziziensis/decumbens diploide) e posição das 3 cópias homeólogas de locus_001 localizadas em cromossomos nomeados.</w:t>
+      </w:r>
+    </w:p>
+    <w:p>
+      <w:r>
+        <w:rPr>
+          <w:b/>
+          <w:i w:val="0"/>
+          <w:sz w:val="22"/>
+        </w:rPr>
+        <w:t>CAL5051155.1 (gene URODEC1_LOCUS91967, cromossomo 36b, OZ075146.1:7.157.787–7.159.709, fita +) é a cópia real do subgenoma brizantha e difere da predição de locus_001 (via U. ruziziensis) por exatamente 1 aminoácido (posição ~53, V→I) — 173/174 aa idênticos.</w:t>
+      </w:r>
+    </w:p>
+    <w:p>
+      <w:r>
+        <w:rPr>
+          <w:b w:val="0"/>
+          <w:i w:val="0"/>
+          <w:sz w:val="22"/>
+        </w:rPr>
+        <w:t>Dois ganhos diretos: (1) a divergência espécie-proxy, antes desconhecida, agora é um número baixo e conhecido — 1 substituição conservativa em 174 posições; (2) o gene tem anotação de mRNA completo com UTRs reais (1.222 nt totais vs. 525 nt de CDS, ~697 nt de UTR 5'+3'), algo que a predição via miniprot em U. ruziziensis nunca teve. A estrutura de 4 éxons/3 íntrons foi confirmada de forma independente, reforçando a confiança na predição original.</w:t>
+      </w:r>
+    </w:p>
+    <w:p>
+      <w:pPr>
+        <w:jc w:val="center"/>
+      </w:pPr>
+      <w:r>
+        <w:drawing>
+          <wp:inline xmlns:a="http://schemas.openxmlformats.org/drawingml/2006/main" xmlns:pic="http://schemas.openxmlformats.org/drawingml/2006/picture">
+            <wp:extent cx="5760000" cy="2513455"/>
+            <wp:docPr id="6" name="Picture 6"/>
+            <wp:cNvGraphicFramePr>
+              <a:graphicFrameLocks noChangeAspect="1"/>
+            </wp:cNvGraphicFramePr>
+            <a:graphic>
+              <a:graphicData uri="http://schemas.openxmlformats.org/drawingml/2006/picture">
+                <pic:pic>
+                  <pic:nvPicPr>
+                    <pic:cNvPr id="0" name="esquema_estrutura_genica.png"/>
+                    <pic:cNvPicPr/>
+                  </pic:nvPicPr>
+                  <pic:blipFill>
+                    <a:blip r:embed="rId14"/>
+                    <a:stretch>
+                      <a:fillRect/>
+                    </a:stretch>
+                  </pic:blipFill>
+                  <pic:spPr>
+                    <a:xfrm>
+                      <a:off x="0" y="0"/>
+                      <a:ext cx="5760000" cy="2513455"/>
+                    </a:xfrm>
+                    <a:prstGeom prst="rect"/>
+                  </pic:spPr>
+                </pic:pic>
+              </a:graphicData>
+            </a:graphic>
+          </wp:inline>
+        </w:drawing>
+      </w:r>
+    </w:p>
+    <w:p>
+      <w:pPr>
+        <w:spacing w:after="240"/>
+        <w:jc w:val="center"/>
+      </w:pPr>
+      <w:r>
+        <w:rPr>
+          <w:i/>
+          <w:color w:val="555555"/>
+          <w:sz w:val="18"/>
+        </w:rPr>
+        <w:t>Figura E. Estrutura gênica em escala: predição original de locus_001 (só CDS, via miniprot, sem UTR) comparada à anotação real do gene homólogo no subgenoma brizantha (URODEC1_LOCUS91967) — mesmos 4 éxons/3 íntrons, agora com UTRs 5' e 3' reais.</w:t>
+      </w:r>
+    </w:p>
+    <w:p>
+      <w:r>
+        <w:rPr>
+          <w:b w:val="0"/>
+          <w:i w:val="0"/>
+          <w:sz w:val="22"/>
+        </w:rPr>
+        <w:t>O que isso não resolve: a cv. Basilisk (U. decumbens) não é a cv. Marandu (U. brizantha, a cultivar real do projeto) — pode haver diferença adicional entre cultivares/acessos não capturada aqui. Confirmação por PCR e sequenciamento Sanger em DNA genômico real da cv. Marandu continua recomendada (Seção 5.1), mas agora partindo de uma sequência-molde de U. brizantha de verdade, com risco de divergência residual já quantificado como baixo. Sequências completas disponíveis em brizantha_search/ no repositório do projeto.</w:t>
+      </w:r>
+    </w:p>
+    <w:p>
+      <w:pPr>
+        <w:jc w:val="center"/>
+      </w:pPr>
+      <w:r>
+        <w:drawing>
+          <wp:inline xmlns:a="http://schemas.openxmlformats.org/drawingml/2006/main" xmlns:pic="http://schemas.openxmlformats.org/drawingml/2006/picture">
+            <wp:extent cx="4680000" cy="4680000"/>
+            <wp:docPr id="7" name="Picture 7"/>
+            <wp:cNvGraphicFramePr>
+              <a:graphicFrameLocks noChangeAspect="1"/>
+            </wp:cNvGraphicFramePr>
+            <a:graphic>
+              <a:graphicData uri="http://schemas.openxmlformats.org/drawingml/2006/picture">
+                <pic:pic>
+                  <pic:nvPicPr>
+                    <pic:cNvPr id="0" name="esquema_convergencia_evidencias.png"/>
+                    <pic:cNvPicPr/>
+                  </pic:nvPicPr>
+                  <pic:blipFill>
+                    <a:blip r:embed="rId15"/>
+                    <a:stretch>
+                      <a:fillRect/>
+                    </a:stretch>
+                  </pic:blipFill>
+                  <pic:spPr>
+                    <a:xfrm>
+                      <a:off x="0" y="0"/>
+                      <a:ext cx="4680000" cy="4680000"/>
+                    </a:xfrm>
+                    <a:prstGeom prst="rect"/>
+                  </pic:spPr>
+                </pic:pic>
+              </a:graphicData>
+            </a:graphic>
+          </wp:inline>
+        </w:drawing>
+      </w:r>
+    </w:p>
+    <w:p>
+      <w:pPr>
+        <w:spacing w:after="240"/>
+        <w:jc w:val="center"/>
+      </w:pPr>
+      <w:r>
+        <w:rPr>
+          <w:i/>
+          <w:color w:val="555555"/>
+          <w:sz w:val="18"/>
+        </w:rPr>
+        <w:t>Figura F. Síntese das seis linhas de evidência independentes que confirmam locus_001 como candidato a ortólogo de FT — sequência (TBLASTN, BLASTN_CDS, miniprot), ortologia (RBH), filogenia e, agora, confirmação direta no subgenoma real de U. brizantha.</w:t>
       </w:r>
     </w:p>
     <w:p>
@@ -2436,7 +3134,7 @@
         <w:rPr>
           <w:color w:val="1F3A5F"/>
         </w:rPr>
-        <w:t>5.2 Gap espécie-proxy não quantificado (bloqueante)</w:t>
+        <w:t>5.2 Gap espécie-proxy — PARCIALMENTE RESOLVIDO em 11/07/2026 (era bloqueante)</w:t>
       </w:r>
     </w:p>
     <w:p>
@@ -2446,7 +3144,7 @@
           <w:i w:val="0"/>
           <w:sz w:val="22"/>
         </w:rPr>
-        <w:t>locus_001 foi encontrado em U. ruziziensis (diploide), não em U. brizantha (poliploide agâmica, a espécie real de bancada). Não há estimativa de percentual de identidade esperado entre as duas espécies nessa região específica — o risco de mismatch em primers (mais sensível a poucos SNPs do que dsRNA processado) é real e de magnitude atualmente desconhecida.</w:t>
+        <w:t>locus_001 foi originalmente encontrado só em U. ruziziensis (diploide), não em U. brizantha (poliploide agâmica, a espécie real de bancada), sem nenhuma estimativa de divergência entre as duas.</w:t>
       </w:r>
     </w:p>
     <w:p>
@@ -2456,7 +3154,17 @@
           <w:i w:val="0"/>
           <w:sz w:val="22"/>
         </w:rPr>
-        <w:t>Recomendação: não finalizar primers/dsRNA a partir da sequência de U. ruziziensis isolada. Usar o sequenciamento Sanger de U. brizantha real (Seção 5.1) para gerar a sequência-alvo definitiva. Se primers forem usados agora para triagem, desenhá-los com bases degeneradas ou em regiões mais conservadas.</w:t>
+        <w:t>Atualização (Seção 3.7): o subgenoma brizantha real do assembly de U. decumbens cv. Basilisk (GCA_964030465.3) tem uma cópia quase idêntica (CAL5051155.1, cromossomo 36b) — 99,4% idêntica, 1 substituição de aminoácido em 174. A divergência deixou de ser uma incógnita e passou a ser um número baixo e conhecido.</w:t>
+      </w:r>
+    </w:p>
+    <w:p>
+      <w:r>
+        <w:rPr>
+          <w:b/>
+          <w:i w:val="0"/>
+          <w:sz w:val="22"/>
+        </w:rPr>
+        <w:t>O que ainda falta: essa é a cultivar Basilisk, não a Marandu (cultivar real do projeto) — pode haver diferença adicional entre cultivares/acessos de brizantha não capturada aqui. Recomendação atualizada: usar a sequência brizantha_CDS.fasta (Seção 3.7) — não mais a predição em U. ruziziensis isolada — como molde para desenho de primers de triagem; confirmar por PCR e Sanger em DNA genômico real da cv. Marandu (Seção 5.1) antes do desenho final, agora partindo de uma base de brizantha de verdade com risco de divergência residual já conhecido como baixo.</w:t>
       </w:r>
     </w:p>
     <w:p>
@@ -2529,7 +3237,7 @@
         <w:rPr>
           <w:color w:val="1F3A5F"/>
         </w:rPr>
-        <w:t>5.5 Extensão exata do transcrito incerta</w:t>
+        <w:t>5.5 Extensão exata do transcrito — PARCIALMENTE RESOLVIDO em 11/07/2026</w:t>
       </w:r>
     </w:p>
     <w:p>
@@ -2539,7 +3247,7 @@
           <w:i w:val="0"/>
           <w:sz w:val="22"/>
         </w:rPr>
-        <w:t>O modelo gênico de locus_001 (4 éxons, 3 íntrons, stop códon no lugar esperado — estrutura compatível com FT de gramíneas) vem inteiramente de alinhamento spliced-aware de proteínas de referência de outras espécies contra o genoma (miniprot), não de RNA-seq real de Urochloa. Não há UTR modelada nem confirmação de sítio real de início/fim de transcrição.</w:t>
+        <w:t>O modelo gênico original de locus_001 (4 éxons, 3 íntrons, stop códon no lugar esperado) veio inteiramente de alinhamento spliced-aware via miniprot, sem UTR modelada.</w:t>
       </w:r>
     </w:p>
     <w:p>
@@ -2549,7 +3257,17 @@
           <w:i w:val="0"/>
           <w:sz w:val="22"/>
         </w:rPr>
-        <w:t>Recomendação: antes de fixar as bordas do amplicon/dsRNA, realizar 5'/3' RACE (ou RT-PCR ancorado com extensão para regiões flanqueadoras) em RNA real de U. brizantha — a UTR 3' é frequentemente preferida para desenho de dsRNA/RT-qPCR por ser mais específica e menos conservada entre parálogos, e essa região simplesmente não existe na predição atual.</w:t>
+        <w:t>Atualização (Seção 3.7): o gene homólogo real no subgenoma brizantha do assembly U. decumbens (URODEC1_LOCUS91967) tem anotação de mRNA completo com UTRs (1.222 nt totais, 525 nt de CDS, ~697 nt de UTR 5'+3' reais). A estrutura de 4 éxons/3 íntrons foi confirmada de forma independente.</w:t>
+      </w:r>
+    </w:p>
+    <w:p>
+      <w:r>
+        <w:rPr>
+          <w:b/>
+          <w:i w:val="0"/>
+          <w:sz w:val="22"/>
+        </w:rPr>
+        <w:t>O que ainda falta: não está confirmado se a anotação de UTR veio de evidência transcricional direta (RNA-seq) da própria U. decumbens/brizantha ou de modelo computacional. Recomendação atualizada: usar brizantha_mRNA_with_UTR.fasta (Seção 3.7) como ponto de partida para desenho de primers/dsRNA na região de UTR 3' (mais específica entre parálogos), mas confirmar por 5'/3' RACE ou RT-PCR ancorado em RNA real de U. brizantha cv. Marandu antes do desenho final.</w:t>
       </w:r>
     </w:p>
     <w:p>
@@ -2635,7 +3353,7 @@
           <w:i w:val="0"/>
           <w:sz w:val="22"/>
         </w:rPr>
-        <w:t>locus_001 é um candidato forte e bem fundamentado dentro do que a bioinformática pode provar. Isso não é o mesmo que "pronto para desenho final de primers/dsRNA em bancada". Os itens 5.1 a 5.3 (validação experimental, gap de espécie-proxy, off-target) são bloqueantes reais e recomenda-se resolvê-los em sequência — sequenciamento Sanger de U. brizantha real primeiro, depois análise de off-target — antes de qualquer decisão de síntese de dsRNA.</w:t>
+        <w:t>locus_001 é um candidato forte e bem fundamentado dentro do que a bioinformática pode provar, e ficou mais forte ainda em 11/07/2026 com a confirmação em sequência real de brizantha (Seção 3.7): divergência de apenas 1 aminoácido e UTRs reais disponíveis, reduzindo dois gargalos (5.2, 5.5) de "bloqueante" para "parcialmente resolvido". Isso ainda não é o mesmo que "pronto para desenho final de primers/dsRNA em bancada". Seguem bloqueantes: 5.1 (validação experimental — nenhum PCR/RT-PCR real feito ainda) e 5.3 (off-target — ainda não avaliado, exigido pela proposta). Recomendação de sequência: PCR e Sanger em DNA genômico real da cv. Marandu usando a sequência de brizantha_CDS.fasta (Seção 3.7) como molde primeiro, depois off-target, antes de qualquer decisão de síntese de dsRNA.</w:t>
       </w:r>
     </w:p>
     <w:p>
@@ -2656,7 +3374,7 @@
           <w:i w:val="0"/>
           <w:sz w:val="22"/>
         </w:rPr>
-        <w:t>A análise de bioinformática identificou e confirmou, com três linhas independentes de evidência (sequência, ortologia recíproca e filogenia), locus_001 como candidato a ortólogo do gene FLOWERING LOCUS T em Urochloa ruziziensis, adequado para orientar a próxima etapa de seleção de regiões conservadas para desenho de dsRNA (Objetivo Específico 1 da proposta científica). Um segundo achado — a reclassificação de locus_012 como ortólogo de MFT, não de FT — refina a compreensão da família gênica FT-like em Urochloa e evita um possível erro de direcionamento do dsRNA.</w:t>
+        <w:t>A análise de bioinformática identificou e confirmou, com três linhas independentes de evidência (sequência, ortologia recíproca e filogenia), locus_001 como candidato a ortólogo do gene FLOWERING LOCUS T em Urochloa ruziziensis, adequado para orientar a próxima etapa de seleção de regiões conservadas para desenho de dsRNA (Objetivo Específico 1 da proposta científica). Um segundo achado — a reclassificação de locus_012 como ortólogo de MFT, não de FT — refina a compreensão da família gênica FT-like em Urochloa e evita um possível erro de direcionamento do dsRNA. Um terceiro achado, obtido no mesmo dia da revisão que originou este relatório, elevou a confiança no resultado de forma direta: a busca da sequência de locus_001 no subgenoma real de U. brizantha, presente no assembly publicado de U. decumbens cv. Basilisk, encontrou uma cópia 99,4% idêntica — divergência mínima e agora quantificada, com UTRs reais disponíveis pela primeira vez.</w:t>
       </w:r>
     </w:p>
     <w:p>
@@ -2666,7 +3384,7 @@
           <w:i w:val="0"/>
           <w:sz w:val="22"/>
         </w:rPr>
-        <w:t>Ao mesmo tempo, este relatório documenta de forma explícita e honesta os limites do que a bioinformática pode garantir sozinha: o resultado é in silico, baseado numa espécie-proxy, e ainda carece da análise de especificidade off-target exigida pela própria proposta. A Seção 5 define um caminho concreto e sequencial para transformar este candidato confirmado por bioinformática em uma sequência segura para síntese de dsRNA em bancada.</w:t>
+        <w:t>Ao mesmo tempo, este relatório documenta de forma explícita e honesta os limites do que a bioinformática pode garantir sozinha: o resultado ainda é in silico e carece da análise de especificidade off-target exigida pela própria proposta, além de confirmação experimental direta na cultivar de trabalho (Marandu). A Seção 5 define um caminho concreto e sequencial para transformar este candidato confirmado por bioinformática — agora apoiado em sequência real de brizantha — em uma sequência segura para síntese de dsRNA em bancada.</w:t>
       </w:r>
     </w:p>
     <w:p>

</xml_diff>

<commit_message>
Correlaciona locus_XXX do pipeline com gene ID real no subgenoma brizantha
Estende a busca no proteoma de U. decumbens cv. Basilisk (ja feita so
para locus_001) as outras 5 loci confirmadas (002, 005, 009, 012, 015),
gerando uma tabela de correlacao locus->gene ID real (accession +
locus_tag) por subgenoma. Confirma tambem que o assembly-alvo
Embrapa_Uruz_1.0 (U. ruziziensis) nao tem anotacao genica oficial no
NCBI, entao a correlacao com o subgenoma brizantha de decumbens e a
unica fonte de gene ID real disponivel.

Co-Authored-By: Claude Sonnet 5 <noreply@anthropic.com>
</commit_message>
<xml_diff>
--- a/relatorio_isa_lbmp.docx
+++ b/relatorio_isa_lbmp.docx
@@ -3021,6 +3021,645 @@
     </w:p>
     <w:p>
       <w:pPr>
+        <w:pStyle w:val="Heading2"/>
+      </w:pPr>
+      <w:r>
+        <w:rPr>
+          <w:color w:val="1F3A5F"/>
+        </w:rPr>
+        <w:t>3.8 Correlação locus_XXX (pipeline) com gene ID real no subgenoma brizantha</w:t>
+      </w:r>
+    </w:p>
+    <w:p>
+      <w:r>
+        <w:rPr>
+          <w:b w:val="0"/>
+          <w:i w:val="0"/>
+          <w:sz w:val="22"/>
+        </w:rPr>
+        <w:t>A Seção 3.7 confirmou locus_001 no subgenoma real de U. brizantha. Essa mesma metodologia (BLASTP local contra o proteoma anotado de U. decumbens cv. Basilisk, cruzado com o mapeamento cromossomo-subgenoma) foi estendida às outras 5 loci que também confirmam pebp_confirmed=True e rbh_confirmed=True no pipeline (locus_002, 005, 009, 012, 015), para correlacionar cada identificador interno do pipeline com um gene ID real.</w:t>
+      </w:r>
+    </w:p>
+    <w:p>
+      <w:r>
+        <w:rPr>
+          <w:b w:val="0"/>
+          <w:i w:val="0"/>
+          <w:sz w:val="22"/>
+        </w:rPr>
+        <w:t>Verificação prévia: o assembly-alvo Embrapa_Uruz_1.0 (U. ruziziensis) não tem anotação gênica oficial no NCBI (sem campo annotation_info retornado pela API de datasets) — não existe "gene ID NCBI" nativo para nenhum locus_XXX na espécie-proxy. O único ID de gene real disponível vem da correlação com o subgenoma brizantha do assembly de decumbens, como já feito para locus_001.</w:t>
+      </w:r>
+    </w:p>
+    <w:tbl>
+      <w:tblPr>
+        <w:tblStyle w:val="TableGrid"/>
+        <w:tblW w:type="auto" w:w="0"/>
+        <w:jc w:val="center"/>
+        <w:tblLook w:firstColumn="1" w:firstRow="1" w:lastColumn="0" w:lastRow="0" w:noHBand="0" w:noVBand="1" w:val="04A0"/>
+      </w:tblPr>
+      <w:tblGrid>
+        <w:gridCol w:w="1881"/>
+        <w:gridCol w:w="1881"/>
+        <w:gridCol w:w="1881"/>
+        <w:gridCol w:w="1881"/>
+        <w:gridCol w:w="1881"/>
+      </w:tblGrid>
+      <w:tr>
+        <w:tc>
+          <w:tcPr>
+            <w:tcW w:type="dxa" w:w="1701"/>
+            <w:shd w:fill="1F3A5F"/>
+          </w:tcPr>
+          <w:p>
+            <w:r>
+              <w:rPr>
+                <w:color w:val="FFFFFF"/>
+              </w:rPr>
+            </w:r>
+            <w:r>
+              <w:rPr>
+                <w:b/>
+                <w:sz w:val="18"/>
+              </w:rPr>
+              <w:t>Locus (pipeline)</w:t>
+            </w:r>
+          </w:p>
+        </w:tc>
+        <w:tc>
+          <w:tcPr>
+            <w:tcW w:type="dxa" w:w="2268"/>
+            <w:shd w:fill="1F3A5F"/>
+          </w:tcPr>
+          <w:p>
+            <w:r>
+              <w:rPr>
+                <w:color w:val="FFFFFF"/>
+              </w:rPr>
+            </w:r>
+            <w:r>
+              <w:rPr>
+                <w:b/>
+                <w:sz w:val="18"/>
+              </w:rPr>
+              <w:t>Classificação</w:t>
+            </w:r>
+          </w:p>
+        </w:tc>
+        <w:tc>
+          <w:tcPr>
+            <w:tcW w:type="dxa" w:w="2551"/>
+            <w:shd w:fill="1F3A5F"/>
+          </w:tcPr>
+          <w:p>
+            <w:r>
+              <w:rPr>
+                <w:color w:val="FFFFFF"/>
+              </w:rPr>
+            </w:r>
+            <w:r>
+              <w:rPr>
+                <w:b/>
+                <w:sz w:val="18"/>
+              </w:rPr>
+              <w:t>Melhor cópia subgenoma b</w:t>
+            </w:r>
+          </w:p>
+        </w:tc>
+        <w:tc>
+          <w:tcPr>
+            <w:tcW w:type="dxa" w:w="1417"/>
+            <w:shd w:fill="1F3A5F"/>
+          </w:tcPr>
+          <w:p>
+            <w:r>
+              <w:rPr>
+                <w:color w:val="FFFFFF"/>
+              </w:rPr>
+            </w:r>
+            <w:r>
+              <w:rPr>
+                <w:b/>
+                <w:sz w:val="18"/>
+              </w:rPr>
+              <w:t>Identidade</w:t>
+            </w:r>
+          </w:p>
+        </w:tc>
+        <w:tc>
+          <w:tcPr>
+            <w:tcW w:type="dxa" w:w="2835"/>
+            <w:shd w:fill="1F3A5F"/>
+          </w:tcPr>
+          <w:p>
+            <w:r>
+              <w:rPr>
+                <w:color w:val="FFFFFF"/>
+              </w:rPr>
+            </w:r>
+            <w:r>
+              <w:rPr>
+                <w:b/>
+                <w:sz w:val="18"/>
+              </w:rPr>
+              <w:t>Gene ID (locus_tag)</w:t>
+            </w:r>
+          </w:p>
+        </w:tc>
+      </w:tr>
+      <w:tr>
+        <w:tc>
+          <w:tcPr>
+            <w:tcW w:type="dxa" w:w="1701"/>
+          </w:tcPr>
+          <w:p>
+            <w:r/>
+            <w:r>
+              <w:rPr>
+                <w:b w:val="0"/>
+                <w:sz w:val="18"/>
+              </w:rPr>
+              <w:t>locus_001</w:t>
+            </w:r>
+          </w:p>
+        </w:tc>
+        <w:tc>
+          <w:tcPr>
+            <w:tcW w:type="dxa" w:w="2268"/>
+          </w:tcPr>
+          <w:p>
+            <w:r/>
+            <w:r>
+              <w:rPr>
+                <w:b w:val="0"/>
+                <w:sz w:val="18"/>
+              </w:rPr>
+              <w:t>FT-like (Hd3a/RFT1-type)</w:t>
+            </w:r>
+          </w:p>
+        </w:tc>
+        <w:tc>
+          <w:tcPr>
+            <w:tcW w:type="dxa" w:w="2551"/>
+          </w:tcPr>
+          <w:p>
+            <w:r/>
+            <w:r>
+              <w:rPr>
+                <w:b w:val="0"/>
+                <w:sz w:val="18"/>
+              </w:rPr>
+              <w:t>CAL5051155.1</w:t>
+            </w:r>
+          </w:p>
+        </w:tc>
+        <w:tc>
+          <w:tcPr>
+            <w:tcW w:type="dxa" w:w="1417"/>
+          </w:tcPr>
+          <w:p>
+            <w:r/>
+            <w:r>
+              <w:rPr>
+                <w:b w:val="0"/>
+                <w:sz w:val="18"/>
+              </w:rPr>
+              <w:t>99,4%</w:t>
+            </w:r>
+          </w:p>
+        </w:tc>
+        <w:tc>
+          <w:tcPr>
+            <w:tcW w:type="dxa" w:w="2835"/>
+          </w:tcPr>
+          <w:p>
+            <w:r/>
+            <w:r>
+              <w:rPr>
+                <w:b w:val="0"/>
+                <w:sz w:val="18"/>
+              </w:rPr>
+              <w:t>URODEC1_LOCUS91967 (chr 36b)</w:t>
+            </w:r>
+          </w:p>
+        </w:tc>
+      </w:tr>
+      <w:tr>
+        <w:tc>
+          <w:tcPr>
+            <w:tcW w:type="dxa" w:w="1701"/>
+          </w:tcPr>
+          <w:p>
+            <w:r/>
+            <w:r>
+              <w:rPr>
+                <w:b w:val="0"/>
+                <w:sz w:val="18"/>
+              </w:rPr>
+              <w:t>locus_002</w:t>
+            </w:r>
+          </w:p>
+        </w:tc>
+        <w:tc>
+          <w:tcPr>
+            <w:tcW w:type="dxa" w:w="2268"/>
+          </w:tcPr>
+          <w:p>
+            <w:r/>
+            <w:r>
+              <w:rPr>
+                <w:b w:val="0"/>
+                <w:sz w:val="18"/>
+              </w:rPr>
+              <w:t>FT-like (fragmento fraco)</w:t>
+            </w:r>
+          </w:p>
+        </w:tc>
+        <w:tc>
+          <w:tcPr>
+            <w:tcW w:type="dxa" w:w="2551"/>
+          </w:tcPr>
+          <w:p>
+            <w:r/>
+            <w:r>
+              <w:rPr>
+                <w:b w:val="0"/>
+                <w:sz w:val="18"/>
+              </w:rPr>
+              <w:t>CAL5082316.1 / CAL5087382.1 (empate)</w:t>
+            </w:r>
+          </w:p>
+        </w:tc>
+        <w:tc>
+          <w:tcPr>
+            <w:tcW w:type="dxa" w:w="1417"/>
+          </w:tcPr>
+          <w:p>
+            <w:r/>
+            <w:r>
+              <w:rPr>
+                <w:b w:val="0"/>
+                <w:sz w:val="18"/>
+              </w:rPr>
+              <w:t>100,0%</w:t>
+            </w:r>
+          </w:p>
+        </w:tc>
+        <w:tc>
+          <w:tcPr>
+            <w:tcW w:type="dxa" w:w="2835"/>
+          </w:tcPr>
+          <w:p>
+            <w:r/>
+            <w:r>
+              <w:rPr>
+                <w:b w:val="0"/>
+                <w:sz w:val="18"/>
+              </w:rPr>
+              <w:t>URODEC1_LOCUS109225 / 112169 (chr 7b/8b)</w:t>
+            </w:r>
+          </w:p>
+        </w:tc>
+      </w:tr>
+      <w:tr>
+        <w:tc>
+          <w:tcPr>
+            <w:tcW w:type="dxa" w:w="1701"/>
+          </w:tcPr>
+          <w:p>
+            <w:r/>
+            <w:r>
+              <w:rPr>
+                <w:b w:val="0"/>
+                <w:sz w:val="18"/>
+              </w:rPr>
+              <w:t>locus_005</w:t>
+            </w:r>
+          </w:p>
+        </w:tc>
+        <w:tc>
+          <w:tcPr>
+            <w:tcW w:type="dxa" w:w="2268"/>
+          </w:tcPr>
+          <w:p>
+            <w:r/>
+            <w:r>
+              <w:rPr>
+                <w:b w:val="0"/>
+                <w:sz w:val="18"/>
+              </w:rPr>
+              <w:t>FT-like (ZCN8-type)</w:t>
+            </w:r>
+          </w:p>
+        </w:tc>
+        <w:tc>
+          <w:tcPr>
+            <w:tcW w:type="dxa" w:w="2551"/>
+          </w:tcPr>
+          <w:p>
+            <w:r/>
+            <w:r>
+              <w:rPr>
+                <w:b w:val="0"/>
+                <w:sz w:val="18"/>
+              </w:rPr>
+              <w:t>CAL4902238.1</w:t>
+            </w:r>
+          </w:p>
+        </w:tc>
+        <w:tc>
+          <w:tcPr>
+            <w:tcW w:type="dxa" w:w="1417"/>
+          </w:tcPr>
+          <w:p>
+            <w:r/>
+            <w:r>
+              <w:rPr>
+                <w:b w:val="0"/>
+                <w:sz w:val="18"/>
+              </w:rPr>
+              <w:t>91,6%</w:t>
+            </w:r>
+          </w:p>
+        </w:tc>
+        <w:tc>
+          <w:tcPr>
+            <w:tcW w:type="dxa" w:w="2835"/>
+          </w:tcPr>
+          <w:p>
+            <w:r/>
+            <w:r>
+              <w:rPr>
+                <w:b w:val="0"/>
+                <w:sz w:val="18"/>
+              </w:rPr>
+              <w:t>URODEC1_LOCUS9836 (chr 11b)</w:t>
+            </w:r>
+          </w:p>
+        </w:tc>
+      </w:tr>
+      <w:tr>
+        <w:tc>
+          <w:tcPr>
+            <w:tcW w:type="dxa" w:w="1701"/>
+          </w:tcPr>
+          <w:p>
+            <w:r/>
+            <w:r>
+              <w:rPr>
+                <w:b w:val="0"/>
+                <w:sz w:val="18"/>
+              </w:rPr>
+              <w:t>locus_009</w:t>
+            </w:r>
+          </w:p>
+        </w:tc>
+        <w:tc>
+          <w:tcPr>
+            <w:tcW w:type="dxa" w:w="2268"/>
+          </w:tcPr>
+          <w:p>
+            <w:r/>
+            <w:r>
+              <w:rPr>
+                <w:b w:val="0"/>
+                <w:sz w:val="18"/>
+              </w:rPr>
+              <w:t>FT-like (par 009/015)</w:t>
+            </w:r>
+          </w:p>
+        </w:tc>
+        <w:tc>
+          <w:tcPr>
+            <w:tcW w:type="dxa" w:w="2551"/>
+          </w:tcPr>
+          <w:p>
+            <w:r/>
+            <w:r>
+              <w:rPr>
+                <w:b w:val="0"/>
+                <w:sz w:val="18"/>
+              </w:rPr>
+              <w:t>CAL4952393.1</w:t>
+            </w:r>
+          </w:p>
+        </w:tc>
+        <w:tc>
+          <w:tcPr>
+            <w:tcW w:type="dxa" w:w="1417"/>
+          </w:tcPr>
+          <w:p>
+            <w:r/>
+            <w:r>
+              <w:rPr>
+                <w:b w:val="0"/>
+                <w:sz w:val="18"/>
+              </w:rPr>
+              <w:t>98,8%</w:t>
+            </w:r>
+          </w:p>
+        </w:tc>
+        <w:tc>
+          <w:tcPr>
+            <w:tcW w:type="dxa" w:w="2835"/>
+          </w:tcPr>
+          <w:p>
+            <w:r/>
+            <w:r>
+              <w:rPr>
+                <w:b w:val="0"/>
+                <w:sz w:val="18"/>
+              </w:rPr>
+              <w:t>URODEC1_LOCUS39484 (chr 17b)</w:t>
+            </w:r>
+          </w:p>
+        </w:tc>
+      </w:tr>
+      <w:tr>
+        <w:tc>
+          <w:tcPr>
+            <w:tcW w:type="dxa" w:w="1701"/>
+          </w:tcPr>
+          <w:p>
+            <w:r/>
+            <w:r>
+              <w:rPr>
+                <w:b w:val="0"/>
+                <w:sz w:val="18"/>
+              </w:rPr>
+              <w:t>locus_012</w:t>
+            </w:r>
+          </w:p>
+        </w:tc>
+        <w:tc>
+          <w:tcPr>
+            <w:tcW w:type="dxa" w:w="2268"/>
+          </w:tcPr>
+          <w:p>
+            <w:r/>
+            <w:r>
+              <w:rPr>
+                <w:b w:val="0"/>
+                <w:sz w:val="18"/>
+              </w:rPr>
+              <w:t>MFT-like (reclassificado)</w:t>
+            </w:r>
+          </w:p>
+        </w:tc>
+        <w:tc>
+          <w:tcPr>
+            <w:tcW w:type="dxa" w:w="2551"/>
+          </w:tcPr>
+          <w:p>
+            <w:r/>
+            <w:r>
+              <w:rPr>
+                <w:b w:val="0"/>
+                <w:sz w:val="18"/>
+              </w:rPr>
+              <w:t>CAL4950975.1</w:t>
+            </w:r>
+          </w:p>
+        </w:tc>
+        <w:tc>
+          <w:tcPr>
+            <w:tcW w:type="dxa" w:w="1417"/>
+          </w:tcPr>
+          <w:p>
+            <w:r/>
+            <w:r>
+              <w:rPr>
+                <w:b w:val="0"/>
+                <w:sz w:val="18"/>
+              </w:rPr>
+              <w:t>100,0%</w:t>
+            </w:r>
+          </w:p>
+        </w:tc>
+        <w:tc>
+          <w:tcPr>
+            <w:tcW w:type="dxa" w:w="2835"/>
+          </w:tcPr>
+          <w:p>
+            <w:r/>
+            <w:r>
+              <w:rPr>
+                <w:b w:val="0"/>
+                <w:sz w:val="18"/>
+              </w:rPr>
+              <w:t>URODEC1_LOCUS38694 (chr 17b)</w:t>
+            </w:r>
+          </w:p>
+        </w:tc>
+      </w:tr>
+      <w:tr>
+        <w:tc>
+          <w:tcPr>
+            <w:tcW w:type="dxa" w:w="1701"/>
+          </w:tcPr>
+          <w:p>
+            <w:r/>
+            <w:r>
+              <w:rPr>
+                <w:b w:val="0"/>
+                <w:sz w:val="18"/>
+              </w:rPr>
+              <w:t>locus_015</w:t>
+            </w:r>
+          </w:p>
+        </w:tc>
+        <w:tc>
+          <w:tcPr>
+            <w:tcW w:type="dxa" w:w="2268"/>
+          </w:tcPr>
+          <w:p>
+            <w:r/>
+            <w:r>
+              <w:rPr>
+                <w:b w:val="0"/>
+                <w:sz w:val="18"/>
+              </w:rPr>
+              <w:t>FT-like (par 009/015)</w:t>
+            </w:r>
+          </w:p>
+        </w:tc>
+        <w:tc>
+          <w:tcPr>
+            <w:tcW w:type="dxa" w:w="2551"/>
+          </w:tcPr>
+          <w:p>
+            <w:r/>
+            <w:r>
+              <w:rPr>
+                <w:b w:val="0"/>
+                <w:sz w:val="18"/>
+              </w:rPr>
+              <w:t>CAL4952393.1</w:t>
+            </w:r>
+          </w:p>
+        </w:tc>
+        <w:tc>
+          <w:tcPr>
+            <w:tcW w:type="dxa" w:w="1417"/>
+          </w:tcPr>
+          <w:p>
+            <w:r/>
+            <w:r>
+              <w:rPr>
+                <w:b w:val="0"/>
+                <w:sz w:val="18"/>
+              </w:rPr>
+              <w:t>98,8%</w:t>
+            </w:r>
+          </w:p>
+        </w:tc>
+        <w:tc>
+          <w:tcPr>
+            <w:tcW w:type="dxa" w:w="2835"/>
+          </w:tcPr>
+          <w:p>
+            <w:r/>
+            <w:r>
+              <w:rPr>
+                <w:b w:val="0"/>
+                <w:sz w:val="18"/>
+              </w:rPr>
+              <w:t>URODEC1_LOCUS39484 (chr 17b)</w:t>
+            </w:r>
+          </w:p>
+        </w:tc>
+      </w:tr>
+    </w:tbl>
+    <w:p>
+      <w:r>
+        <w:rPr>
+          <w:b w:val="0"/>
+          <w:i w:val="0"/>
+          <w:sz w:val="22"/>
+        </w:rPr>
+      </w:r>
+    </w:p>
+    <w:p>
+      <w:r>
+        <w:rPr>
+          <w:b w:val="0"/>
+          <w:i w:val="0"/>
+          <w:sz w:val="22"/>
+        </w:rPr>
+        <w:t>Achados notáveis: locus_001 segue sendo o único caso em que a cópia do subgenoma b já é, ao mesmo tempo, o melhor hit geral de todo o proteoma decumbens. Nos outros 5 loci, o melhor hit geral cai numa cópia rd, e a cópia b correspondente tem identidade igual ou, no caso de locus_005, sensivelmente menor (91,6% vs. 100% da cópia rd) — a maior divergência observada entre as 6 loci confirmadas. locus_009 e locus_015 (parálogos quase idênticos já identificados na filogenia) convergem para exatamente a mesma cópia b (CAL4952393.1/URODEC1_LOCUS39484), replicando por método independente o sinal de parologia recente. locus_012 está na tabela só por rastreabilidade de ID — já reclassificado como MFT-like (Seção 3.5), não é candidato ao gene FT-like da proposta. locus_002 é o caso mais frágil: fragmento de 76 aa com 3 cópias empatadas em 100% no proteoma decumbens (1 rd + 2 b) — evidência insuficiente para apontar uma única cópia b como correta.</w:t>
+      </w:r>
+    </w:p>
+    <w:p>
+      <w:r>
+        <w:rPr>
+          <w:b w:val="0"/>
+          <w:i w:val="0"/>
+          <w:sz w:val="22"/>
+        </w:rPr>
+        <w:t>Tabela completa e arquivos de BLASTP em brizantha_search/loci_brizantha_correlation.tsv no repositório do projeto.</w:t>
+      </w:r>
+    </w:p>
+    <w:p>
+      <w:pPr>
         <w:pStyle w:val="Heading1"/>
       </w:pPr>
       <w:r>

</xml_diff>